<commit_message>
Fill supplementary Table S5 with re-implemented baselines; schema-clean Word output
- Ridge, RBF-SVR, tau-only and without-tau controls re-run in the CPU
  re-implementation and added to Table S5
- Equation notation made renderer-independent; OOXML element order
  normalised so both documents pass schema validation

Co-Authored-By: Claude Opus 5.5 <noreply@anthropic.com>
Claude-Session: https://claude.ai/code/session_011wQfVcjqSLDCo2NCokAy4g
</commit_message>
<xml_diff>
--- a/manuscript/LFP_SOH_PulseFusion_Supplementary.docx
+++ b/manuscript/LFP_SOH_PulseFusion_Supplementary.docx
@@ -691,16 +691,16 @@
         <w:tab/>
       </w:r>
       <m:oMath>
-        <m:acc>
-          <m:accPr>
-            <m:chr m:val="‾"/>
-          </m:accPr>
+        <m:bar>
+          <m:barPr>
+            <m:pos m:val="top"/>
+          </m:barPr>
           <m:e>
             <m:r>
               <m:t>x</m:t>
             </m:r>
           </m:e>
-        </m:acc>
+        </m:bar>
         <m:r>
           <m:rPr>
             <m:sty m:val="p"/>
@@ -870,16 +870,16 @@
                           </m:rPr>
                           <m:t>−</m:t>
                         </m:r>
-                        <m:acc>
-                          <m:accPr>
-                            <m:chr m:val="‾"/>
-                          </m:accPr>
+                        <m:bar>
+                          <m:barPr>
+                            <m:pos m:val="top"/>
+                          </m:barPr>
                           <m:e>
                             <m:r>
                               <m:t>x</m:t>
                             </m:r>
                           </m:e>
-                        </m:acc>
+                        </m:bar>
                       </m:e>
                     </m:d>
                   </m:e>
@@ -1744,16 +1744,16 @@
                             </m:rPr>
                             <m:t>−</m:t>
                           </m:r>
-                          <m:acc>
-                            <m:accPr>
-                              <m:chr m:val="‾"/>
-                            </m:accPr>
+                          <m:bar>
+                            <m:barPr>
+                              <m:pos m:val="top"/>
+                            </m:barPr>
                             <m:e>
                               <m:r>
                                 <m:t>x</m:t>
                               </m:r>
                             </m:e>
-                          </m:acc>
+                          </m:bar>
                         </m:e>
                       </m:d>
                     </m:e>
@@ -2473,16 +2473,16 @@
                       </m:rPr>
                       <m:t>−</m:t>
                     </m:r>
-                    <m:acc>
-                      <m:accPr>
-                        <m:chr m:val="‾"/>
-                      </m:accPr>
+                    <m:bar>
+                      <m:barPr>
+                        <m:pos m:val="top"/>
+                      </m:barPr>
                       <m:e>
                         <m:r>
                           <m:t>x</m:t>
                         </m:r>
                       </m:e>
-                    </m:acc>
+                    </m:bar>
                   </m:e>
                 </m:d>
               </m:e>
@@ -2513,16 +2513,16 @@
                   </m:rPr>
                   <m:t>−</m:t>
                 </m:r>
-                <m:acc>
-                  <m:accPr>
-                    <m:chr m:val="‾"/>
-                  </m:accPr>
+                <m:bar>
+                  <m:barPr>
+                    <m:pos m:val="top"/>
+                  </m:barPr>
                   <m:e>
                     <m:r>
                       <m:t>t</m:t>
                     </m:r>
                   </m:e>
-                </m:acc>
+                </m:bar>
               </m:e>
             </m:d>
           </m:num>
@@ -2573,16 +2573,16 @@
                           </m:rPr>
                           <m:t>−</m:t>
                         </m:r>
-                        <m:acc>
-                          <m:accPr>
-                            <m:chr m:val="‾"/>
-                          </m:accPr>
+                        <m:bar>
+                          <m:barPr>
+                            <m:pos m:val="top"/>
+                          </m:barPr>
                           <m:e>
                             <m:r>
                               <m:t>t</m:t>
                             </m:r>
                           </m:e>
-                        </m:acc>
+                        </m:bar>
                       </m:e>
                     </m:d>
                   </m:e>
@@ -2614,16 +2614,16 @@
           </m:rPr>
           <m:t>=</m:t>
         </m:r>
-        <m:acc>
-          <m:accPr>
-            <m:chr m:val="‾"/>
-          </m:accPr>
+        <m:bar>
+          <m:barPr>
+            <m:pos m:val="top"/>
+          </m:barPr>
           <m:e>
             <m:r>
               <m:t>x</m:t>
             </m:r>
           </m:e>
-        </m:acc>
+        </m:bar>
         <m:r>
           <m:rPr>
             <m:sty m:val="p"/>
@@ -2633,16 +2633,16 @@
         <m:r>
           <m:t>a</m:t>
         </m:r>
-        <m:acc>
-          <m:accPr>
-            <m:chr m:val="‾"/>
-          </m:accPr>
+        <m:bar>
+          <m:barPr>
+            <m:pos m:val="top"/>
+          </m:barPr>
           <m:e>
             <m:r>
               <m:t>t</m:t>
             </m:r>
           </m:e>
-        </m:acc>
+        </m:bar>
         <m:r>
           <m:rPr>
             <m:sty m:val="p"/>
@@ -2813,16 +2813,16 @@
                           </m:rPr>
                           <m:t>−</m:t>
                         </m:r>
-                        <m:acc>
-                          <m:accPr>
-                            <m:chr m:val="‾"/>
-                          </m:accPr>
+                        <m:bar>
+                          <m:barPr>
+                            <m:pos m:val="top"/>
+                          </m:barPr>
                           <m:e>
                             <m:r>
                               <m:t>x</m:t>
                             </m:r>
                           </m:e>
-                        </m:acc>
+                        </m:bar>
                       </m:e>
                     </m:d>
                   </m:e>
@@ -2915,7 +2915,7 @@
         </m:r>
         <m:r>
           <m:rPr>
-            <m:sty m:val="p"/>
+            <m:nor/>
           </m:rPr>
           <m:t>#</m:t>
         </m:r>
@@ -3488,16 +3488,16 @@
                     </m:rPr>
                     <m:t>−</m:t>
                   </m:r>
-                  <m:acc>
-                    <m:accPr>
-                      <m:chr m:val="‾"/>
-                    </m:accPr>
+                  <m:bar>
+                    <m:barPr>
+                      <m:pos m:val="top"/>
+                    </m:barPr>
                     <m:e>
                       <m:r>
                         <m:t>V</m:t>
                       </m:r>
                     </m:e>
-                  </m:acc>
+                  </m:bar>
                 </m:e>
               </m:d>
               <m:r>
@@ -6106,16 +6106,16 @@
                             </m:rPr>
                             <m:t>−</m:t>
                           </m:r>
-                          <m:acc>
-                            <m:accPr>
-                              <m:chr m:val="‾"/>
-                            </m:accPr>
+                          <m:bar>
+                            <m:barPr>
+                              <m:pos m:val="top"/>
+                            </m:barPr>
                             <m:e>
                               <m:r>
                                 <m:t>a</m:t>
                               </m:r>
                             </m:e>
-                          </m:acc>
+                          </m:bar>
                         </m:e>
                       </m:d>
                     </m:e>
@@ -6146,16 +6146,16 @@
                         </m:rPr>
                         <m:t>−</m:t>
                       </m:r>
-                      <m:acc>
-                        <m:accPr>
-                          <m:chr m:val="‾"/>
-                        </m:accPr>
+                      <m:bar>
+                        <m:barPr>
+                          <m:pos m:val="top"/>
+                        </m:barPr>
                         <m:e>
                           <m:r>
                             <m:t>b</m:t>
                           </m:r>
                         </m:e>
-                      </m:acc>
+                      </m:bar>
                     </m:e>
                   </m:d>
                 </m:num>
@@ -6212,16 +6212,16 @@
                                     </m:rPr>
                                     <m:t>−</m:t>
                                   </m:r>
-                                  <m:acc>
-                                    <m:accPr>
-                                      <m:chr m:val="‾"/>
-                                    </m:accPr>
+                                  <m:bar>
+                                    <m:barPr>
+                                      <m:pos m:val="top"/>
+                                    </m:barPr>
                                     <m:e>
                                       <m:r>
                                         <m:t>a</m:t>
                                       </m:r>
                                     </m:e>
-                                  </m:acc>
+                                  </m:bar>
                                 </m:e>
                               </m:d>
                             </m:e>
@@ -6279,16 +6279,16 @@
                                     </m:rPr>
                                     <m:t>−</m:t>
                                   </m:r>
-                                  <m:acc>
-                                    <m:accPr>
-                                      <m:chr m:val="‾"/>
-                                    </m:accPr>
+                                  <m:bar>
+                                    <m:barPr>
+                                      <m:pos m:val="top"/>
+                                    </m:barPr>
                                     <m:e>
                                       <m:r>
                                         <m:t>b</m:t>
                                       </m:r>
                                     </m:e>
-                                  </m:acc>
+                                  </m:bar>
                                 </m:e>
                               </m:d>
                             </m:e>
@@ -6832,7 +6832,7 @@
                 <m:num>
                   <m:r>
                     <m:rPr>
-                      <m:sty m:val="p"/>
+                      <m:nor/>
                     </m:rPr>
                     <m:t>#</m:t>
                   </m:r>
@@ -10640,7 +10640,33 @@
         <w:t xml:space="preserve"> </w:t>
       </w:r>
       <w:r>
-        <w:t xml:space="preserve">&lt; 0.001; 42 of 64 cells), and cells 12 and 3 are again the best- and worst-estimated cells. Table S7 lists all re-implementation results.</w:t>
+        <w:t xml:space="preserve">&lt; 0.001; 42 of 64 cells), and cells 12 and 3 are again the best- and worst-estimated cells. Table S7 lists all re-implementation results. Among the conventional baselines, ridge regression, RBF-SVR and the</w:t>
+      </w:r>
+      <w:r>
+        <w:t xml:space="preserve"> </w:t>
+      </w:r>
+      <w:r>
+        <w:rPr>
+          <w:i/>
+          <w:iCs/>
+        </w:rPr>
+        <w:t xml:space="preserve">τ</w:t>
+      </w:r>
+      <w:r>
+        <w:t xml:space="preserve">-only and without-</w:t>
+      </w:r>
+      <w:r>
+        <w:rPr>
+          <w:i/>
+          <w:iCs/>
+        </w:rPr>
+        <w:t xml:space="preserve">τ</w:t>
+      </w:r>
+      <w:r>
+        <w:t xml:space="preserve"> </w:t>
+      </w:r>
+      <w:r>
+        <w:t xml:space="preserve">controls were re-run and agree with the original values (Table S5); random forest and GPR on the full input were not re-run because of their computational and memory cost.</w:t>
       </w:r>
     </w:p>
     <w:p>
@@ -18766,10 +18792,10 @@
         <w:tblCaption w:val="Supplementary Table S5. Conventional regressors, information-source controls and reference models (SOH pp)."/>
       </w:tblPr>
       <w:tblGrid>
-        <w:gridCol w:w="3281"/>
-        <w:gridCol w:w="2828"/>
-        <w:gridCol w:w="905"/>
-        <w:gridCol w:w="905"/>
+        <w:gridCol w:w="2970"/>
+        <w:gridCol w:w="2530"/>
+        <w:gridCol w:w="990"/>
+        <w:gridCol w:w="1430"/>
       </w:tblGrid>
       <w:tr>
         <w:trPr>
@@ -18860,7 +18886,7 @@
                 <w:b/>
                 <w:noProof/>
               </w:rPr>
-              <w:t xml:space="preserve">Re-implementation</w:t>
+              <w:t xml:space="preserve">Re-implemented</w:t>
             </w:r>
           </w:p>
         </w:tc>
@@ -19145,7 +19171,7 @@
               <w:rPr>
                 <w:noProof/>
               </w:rPr>
-              <w:t xml:space="preserve">—</w:t>
+              <w:t xml:space="preserve">1.879</w:t>
             </w:r>
           </w:p>
         </w:tc>
@@ -19418,7 +19444,7 @@
               <w:rPr>
                 <w:noProof/>
               </w:rPr>
-              <w:t xml:space="preserve">—</w:t>
+              <w:t xml:space="preserve">1.007</w:t>
             </w:r>
           </w:p>
         </w:tc>
@@ -19607,7 +19633,7 @@
               <w:rPr>
                 <w:noProof/>
               </w:rPr>
-              <w:t xml:space="preserve">—</w:t>
+              <w:t xml:space="preserve">3.083</w:t>
             </w:r>
           </w:p>
         </w:tc>
@@ -19705,7 +19731,7 @@
               <w:rPr>
                 <w:noProof/>
               </w:rPr>
-              <w:t xml:space="preserve">—</w:t>
+              <w:t xml:space="preserve">3.095</w:t>
             </w:r>
           </w:p>
         </w:tc>
@@ -19803,7 +19829,7 @@
               <w:rPr>
                 <w:noProof/>
               </w:rPr>
-              <w:t xml:space="preserve">—</w:t>
+              <w:t xml:space="preserve">2.881</w:t>
             </w:r>
           </w:p>
         </w:tc>
@@ -19894,7 +19920,7 @@
               <w:rPr>
                 <w:noProof/>
               </w:rPr>
-              <w:t xml:space="preserve">—</w:t>
+              <w:t xml:space="preserve">2.593</w:t>
             </w:r>
           </w:p>
         </w:tc>
@@ -20076,7 +20102,7 @@
               <w:rPr>
                 <w:noProof/>
               </w:rPr>
-              <w:t xml:space="preserve">—</w:t>
+              <w:t xml:space="preserve">1.698</w:t>
             </w:r>
           </w:p>
         </w:tc>
@@ -20419,7 +20445,7 @@
         <w:t xml:space="preserve">“</w:t>
       </w:r>
       <w:r>
-        <w:t xml:space="preserve">Re-implementation</w:t>
+        <w:t xml:space="preserve">Re-implemented</w:t>
       </w:r>
       <w:r>
         <w:t xml:space="preserve">”</w:t>
@@ -20428,7 +20454,7 @@
         <w:t xml:space="preserve"> </w:t>
       </w:r>
       <w:r>
-        <w:t xml:space="preserve">values come from the CPU re-implementation of Supplementary Note S6 with the same grids (random forest averaged over seeds 0–2).</w:t>
+        <w:t xml:space="preserve">values come from the CPU re-implementation of Supplementary Note S6 with the same grids (random forest averaged over seeds 0–2); —, not run in the re-implementation.</w:t>
       </w:r>
       <w:r>
         <w:t xml:space="preserve"> </w:t>

</xml_diff>

<commit_message>
Add Chinese reading copy and revision notes; fix symbol and appendix details
- manuscript/zh/: Chinese translation of the revised manuscript and
  supplementary material (docx + PDF, sources, glossary) and a
  section-by-section change log against the original Chinese draft
  (论文修改说明 .docx/.pdf/.md).
- Rename the added-noise standard deviation to sigma_noise so it no
  longer clashes with sigma_n in Eq. (9).
- Note S1: restore the original transient-boundary wording and
  response-time levels (alpha = 0.10, 0.50, 0.90) and the i<j wording
  for sample entropy; disclose the re-implementation's choices in Note S6.
- Note S6: compare re-run baselines only where reported values exist.
- Introduction: restore the "under suitable test conditions" qualifier
  for ref. [13].

Co-Authored-By: Claude Opus 5.5 <noreply@anthropic.com>
Claude-Session: https://claude.ai/code/session_011wQfVcjqSLDCo2NCokAy4g
</commit_message>
<xml_diff>
--- a/manuscript/LFP_SOH_PulseFusion_Supplementary.docx
+++ b/manuscript/LFP_SOH_PulseFusion_Supplementary.docx
@@ -6741,7 +6741,7 @@
           <m:rPr>
             <m:sty m:val="p"/>
           </m:rPr>
-          <m:t>≠</m:t>
+          <m:t>&lt;</m:t>
         </m:r>
         <m:r>
           <m:t>j</m:t>
@@ -7784,7 +7784,7 @@
         <w:t xml:space="preserve"> </w:t>
       </w:r>
       <w:r>
-        <w:t xml:space="preserve">Fifteen voltage differences between specified samples describe the steps at current changes (</w:t>
+        <w:t xml:space="preserve">Fifteen voltage differences between specified samples, including the steps at current changes (</w:t>
       </w:r>
       <m:oMath>
         <m:sSub>
@@ -7895,10 +7895,7 @@
         </m:sSub>
       </m:oMath>
       <w:r>
-        <w:t xml:space="preserve"> </w:t>
-      </w:r>
-      <w:r>
-        <w:t xml:space="preserve">and their two-sample counterparts) and the net changes within and across segments (</w:t>
+        <w:t xml:space="preserve">) and the net changes within segments (</w:t>
       </w:r>
       <m:oMath>
         <m:sSub>
@@ -8009,235 +8006,37 @@
         </m:sSub>
       </m:oMath>
       <w:r>
-        <w:t xml:space="preserve">,</w:t>
+        <w:t xml:space="preserve">), describe the transitions between segments. Three response times are defined on the rest segment</w:t>
       </w:r>
       <w:r>
         <w:t xml:space="preserve"> </w:t>
       </w:r>
       <m:oMath>
-        <m:sSub>
+        <m:sSup>
           <m:e>
             <m:r>
-              <m:t>V</m:t>
+              <m:t>S</m:t>
             </m:r>
           </m:e>
-          <m:sub>
-            <m:r>
-              <m:t>30</m:t>
-            </m:r>
-          </m:sub>
-        </m:sSub>
-        <m:r>
-          <m:rPr>
-            <m:sty m:val="p"/>
-          </m:rPr>
-          <m:t>−</m:t>
-        </m:r>
-        <m:sSub>
-          <m:e>
-            <m:r>
-              <m:t>V</m:t>
-            </m:r>
-          </m:e>
-          <m:sub>
-            <m:r>
-              <m:t>0</m:t>
-            </m:r>
-          </m:sub>
-        </m:sSub>
+          <m:sup>
+            <m:d>
+              <m:dPr>
+                <m:begChr m:val="("/>
+                <m:sepChr m:val=""/>
+                <m:endChr m:val=")"/>
+                <m:grow/>
+              </m:dPr>
+              <m:e>
+                <m:r>
+                  <m:t>3</m:t>
+                </m:r>
+              </m:e>
+            </m:d>
+          </m:sup>
+        </m:sSup>
       </m:oMath>
       <w:r>
-        <w:t xml:space="preserve">,</w:t>
-      </w:r>
-      <w:r>
-        <w:t xml:space="preserve"> </w:t>
-      </w:r>
-      <m:oMath>
-        <m:sSub>
-          <m:e>
-            <m:r>
-              <m:t>V</m:t>
-            </m:r>
-          </m:e>
-          <m:sub>
-            <m:r>
-              <m:t>40</m:t>
-            </m:r>
-          </m:sub>
-        </m:sSub>
-        <m:r>
-          <m:rPr>
-            <m:sty m:val="p"/>
-          </m:rPr>
-          <m:t>−</m:t>
-        </m:r>
-        <m:sSub>
-          <m:e>
-            <m:r>
-              <m:t>V</m:t>
-            </m:r>
-          </m:e>
-          <m:sub>
-            <m:r>
-              <m:t>0</m:t>
-            </m:r>
-          </m:sub>
-        </m:sSub>
-      </m:oMath>
-      <w:r>
-        <w:t xml:space="preserve">,</w:t>
-      </w:r>
-      <w:r>
-        <w:t xml:space="preserve"> </w:t>
-      </w:r>
-      <m:oMath>
-        <m:sSub>
-          <m:e>
-            <m:r>
-              <m:t>V</m:t>
-            </m:r>
-          </m:e>
-          <m:sub>
-            <m:r>
-              <m:t>100</m:t>
-            </m:r>
-          </m:sub>
-        </m:sSub>
-        <m:r>
-          <m:rPr>
-            <m:sty m:val="p"/>
-          </m:rPr>
-          <m:t>−</m:t>
-        </m:r>
-        <m:sSub>
-          <m:e>
-            <m:r>
-              <m:t>V</m:t>
-            </m:r>
-          </m:e>
-          <m:sub>
-            <m:r>
-              <m:t>0</m:t>
-            </m:r>
-          </m:sub>
-        </m:sSub>
-      </m:oMath>
-      <w:r>
-        <w:t xml:space="preserve">,</w:t>
-      </w:r>
-      <w:r>
-        <w:t xml:space="preserve"> </w:t>
-      </w:r>
-      <m:oMath>
-        <m:sSub>
-          <m:e>
-            <m:r>
-              <m:t>V</m:t>
-            </m:r>
-          </m:e>
-          <m:sub>
-            <m:r>
-              <m:t>40</m:t>
-            </m:r>
-          </m:sub>
-        </m:sSub>
-        <m:r>
-          <m:rPr>
-            <m:sty m:val="p"/>
-          </m:rPr>
-          <m:t>−</m:t>
-        </m:r>
-        <m:sSub>
-          <m:e>
-            <m:r>
-              <m:t>V</m:t>
-            </m:r>
-          </m:e>
-          <m:sub>
-            <m:r>
-              <m:t>30</m:t>
-            </m:r>
-          </m:sub>
-        </m:sSub>
-      </m:oMath>
-      <w:r>
-        <w:t xml:space="preserve">,</w:t>
-      </w:r>
-      <w:r>
-        <w:t xml:space="preserve"> </w:t>
-      </w:r>
-      <m:oMath>
-        <m:sSub>
-          <m:e>
-            <m:r>
-              <m:t>V</m:t>
-            </m:r>
-          </m:e>
-          <m:sub>
-            <m:r>
-              <m:t>100</m:t>
-            </m:r>
-          </m:sub>
-        </m:sSub>
-        <m:r>
-          <m:rPr>
-            <m:sty m:val="p"/>
-          </m:rPr>
-          <m:t>−</m:t>
-        </m:r>
-        <m:sSub>
-          <m:e>
-            <m:r>
-              <m:t>V</m:t>
-            </m:r>
-          </m:e>
-          <m:sub>
-            <m:r>
-              <m:t>40</m:t>
-            </m:r>
-          </m:sub>
-        </m:sSub>
-      </m:oMath>
-      <w:r>
-        <w:t xml:space="preserve">,</w:t>
-      </w:r>
-      <w:r>
-        <w:t xml:space="preserve"> </w:t>
-      </w:r>
-      <m:oMath>
-        <m:sSub>
-          <m:e>
-            <m:r>
-              <m:t>V</m:t>
-            </m:r>
-          </m:e>
-          <m:sub>
-            <m:r>
-              <m:t>50</m:t>
-            </m:r>
-          </m:sub>
-        </m:sSub>
-        <m:r>
-          <m:rPr>
-            <m:sty m:val="p"/>
-          </m:rPr>
-          <m:t>−</m:t>
-        </m:r>
-        <m:sSub>
-          <m:e>
-            <m:r>
-              <m:t>V</m:t>
-            </m:r>
-          </m:e>
-          <m:sub>
-            <m:r>
-              <m:t>41</m:t>
-            </m:r>
-          </m:sub>
-        </m:sSub>
-      </m:oMath>
-      <w:r>
-        <w:t xml:space="preserve">). Three response times are defined on the rest segment, with linear interpolation between samples and</w:t>
+        <w:t xml:space="preserve">, with linear interpolation between samples and</w:t>
       </w:r>
       <w:r>
         <w:t xml:space="preserve"> </w:t>
@@ -8259,7 +8058,7 @@
           <m:t>{</m:t>
         </m:r>
         <m:r>
-          <m:t>0.5</m:t>
+          <m:t>0.10</m:t>
         </m:r>
         <m:r>
           <m:rPr>
@@ -8268,7 +8067,7 @@
           <m:t>,</m:t>
         </m:r>
         <m:r>
-          <m:t>0.632</m:t>
+          <m:t>0.50</m:t>
         </m:r>
         <m:r>
           <m:rPr>
@@ -8277,7 +8076,7 @@
           <m:t>,</m:t>
         </m:r>
         <m:r>
-          <m:t>0.9</m:t>
+          <m:t>0.90</m:t>
         </m:r>
         <m:r>
           <m:rPr>
@@ -10616,7 +10415,7 @@
         <w:pStyle w:val="FirstParagraph"/>
       </w:pPr>
       <w:r>
-        <w:t xml:space="preserve">The experiments of Section 4.6 were run with an independent re-implementation of the protocol written in Python (NumPy, scikit-learn 1.9 and PyTorch 2.14 on CPU, one thread per run), starting from the publisher’s processed pulse files [31]. Cleaning reproduced the record counts exactly: 17,130 records in 2,855 groups before cleaning, 192 records removed at the 42nd RPT, and 16,938 records in 2,823 complete groups (SOH 72.34–100%) after cleaning. The 143 waveform features were implemented from the definitions in Supplementary Note S1; details not fixed by those definitions, such as the quantile levels of the global family, may differ from the original code. Feature selection was nonetheless similar: in fold 0 it selected 16 frequency and wavelet, 14 segment, 11 difference-dynamics, 6 global, 1 boundary and 1 nonlinear feature together with the DCIR, which ranked 13th; 44 features were selected in every fold and 57 in at least one. The split permutation used NumPy’s default generator with seed 42, which reproduces the fold sizes but not necessarily the fold membership of the original runs. Architectures, loss, optimiser, scheduler, early stopping and seeds follow Sections 3.2–3.4 of the main text, with positional embeddings initialised from U(−0.02, 0.02).</w:t>
+        <w:t xml:space="preserve">The experiments of Section 4.6 were run with an independent re-implementation of the protocol written in Python (NumPy, scikit-learn 1.9 and PyTorch 2.14 on CPU, one thread per run), starting from the publisher’s processed pulse files [31]. Cleaning reproduced the record counts exactly: 17,130 records in 2,855 groups before cleaning, 192 records removed at the 42nd RPT, and 16,938 records in 2,823 complete groups (SOH 72.34–100%) after cleaning. The 143 waveform features were implemented from the definitions in Supplementary Note S1; details not fixed by those definitions, such as the quantile levels of the global family and the nine voltage differences not listed in Note S1, may differ from the original code, and the response-time levels were set to 0.5, 0.632 and 0.9. Feature selection was nonetheless similar: in fold 0 it selected 16 frequency and wavelet, 14 segment, 11 difference-dynamics, 6 global, 1 boundary and 1 nonlinear feature together with the DCIR, which ranked 13th; 44 features were selected in every fold and 57 in at least one. The split permutation used NumPy’s default generator with seed 42, which reproduces the fold sizes but not necessarily the fold membership of the original runs. Architectures, loss, optimiser, scheduler, early stopping and seeds follow Sections 3.2–3.4 of the main text, with positional embeddings initialised from U(−0.02, 0.02).</w:t>
       </w:r>
     </w:p>
     <w:p>
@@ -10640,7 +10439,7 @@
         <w:t xml:space="preserve"> </w:t>
       </w:r>
       <w:r>
-        <w:t xml:space="preserve">&lt; 0.001; 42 of 64 cells), and cells 12 and 3 are again the best- and worst-estimated cells. Table S7 lists all re-implementation results. Among the conventional baselines, ridge regression, RBF-SVR and the</w:t>
+        <w:t xml:space="preserve">&lt; 0.001; 42 of 64 cells), and cells 12 and 3 are again the best- and worst-estimated cells. Table S7 lists all re-implementation results. Among the conventional baselines, ridge regression, RBF-SVR, the</w:t>
       </w:r>
       <w:r>
         <w:t xml:space="preserve"> </w:t>
@@ -10653,7 +10452,7 @@
         <w:t xml:space="preserve">τ</w:t>
       </w:r>
       <w:r>
-        <w:t xml:space="preserve">-only and without-</w:t>
+        <w:t xml:space="preserve">-only controls and the without-</w:t>
       </w:r>
       <w:r>
         <w:rPr>
@@ -10666,7 +10465,46 @@
         <w:t xml:space="preserve"> </w:t>
       </w:r>
       <w:r>
-        <w:t xml:space="preserve">controls were re-run and agree with the original values (Table S5); random forest and GPR on the full input were not re-run because of their computational and memory cost.</w:t>
+        <w:t xml:space="preserve">ridge and GBDT were re-run (Table S5); where reported values exist, they agree closely (RBF-SVR 1.007 vs 1.026 pp, without-</w:t>
+      </w:r>
+      <w:r>
+        <w:rPr>
+          <w:i/>
+          <w:iCs/>
+        </w:rPr>
+        <w:t xml:space="preserve">τ</w:t>
+      </w:r>
+      <w:r>
+        <w:t xml:space="preserve"> </w:t>
+      </w:r>
+      <w:r>
+        <w:t xml:space="preserve">GBDT 1.698 vs 1.663 pp,</w:t>
+      </w:r>
+      <w:r>
+        <w:t xml:space="preserve"> </w:t>
+      </w:r>
+      <w:r>
+        <w:rPr>
+          <w:i/>
+          <w:iCs/>
+        </w:rPr>
+        <w:t xml:space="preserve">τ</w:t>
+      </w:r>
+      <w:r>
+        <w:t xml:space="preserve">-only models about 3 pp). Random forest and GPR on the full input and the without-</w:t>
+      </w:r>
+      <w:r>
+        <w:rPr>
+          <w:i/>
+          <w:iCs/>
+        </w:rPr>
+        <w:t xml:space="preserve">τ</w:t>
+      </w:r>
+      <w:r>
+        <w:t xml:space="preserve"> </w:t>
+      </w:r>
+      <w:r>
+        <w:t xml:space="preserve">random forest were not re-run because of their computational and memory cost.</w:t>
       </w:r>
     </w:p>
     <w:p>
@@ -10724,7 +10562,7 @@
         <w:rPr>
           <w:vertAlign w:val="subscript"/>
         </w:rPr>
-        <w:t xml:space="preserve">n</w:t>
+        <w:t xml:space="preserve">noise</w:t>
       </w:r>
       <w:r>
         <w:t xml:space="preserve"> </w:t>
@@ -23226,7 +23064,7 @@
                 <w:noProof/>
                 <w:vertAlign w:val="subscript"/>
               </w:rPr>
-              <w:t xml:space="preserve">n</w:t>
+              <w:t xml:space="preserve">noise</w:t>
             </w:r>
             <w:r>
               <w:rPr>
@@ -23430,7 +23268,7 @@
                 <w:noProof/>
                 <w:vertAlign w:val="subscript"/>
               </w:rPr>
-              <w:t xml:space="preserve">n</w:t>
+              <w:t xml:space="preserve">noise</w:t>
             </w:r>
             <w:r>
               <w:rPr>
@@ -23634,7 +23472,7 @@
                 <w:noProof/>
                 <w:vertAlign w:val="subscript"/>
               </w:rPr>
-              <w:t xml:space="preserve">n</w:t>
+              <w:t xml:space="preserve">noise</w:t>
             </w:r>
             <w:r>
               <w:rPr>
@@ -24607,7 +24445,7 @@
       <w:jc w:val="both"/>
     </w:pPr>
     <w:rPr>
-      <w:rFonts w:ascii="Times New Roman" w:hAnsi="Times New Roman" w:eastAsia="Times New Roman" w:cs="Times New Roman"/>
+      <w:rFonts w:ascii="Times New Roman" w:hAnsi="Times New Roman" w:cs="Times New Roman" w:eastAsia="Times New Roman"/>
       <w:color w:val="000000"/>
       <w:sz w:val="22"/>
     </w:rPr>
@@ -24623,7 +24461,7 @@
       <w:jc w:val="both"/>
     </w:pPr>
     <w:rPr>
-      <w:rFonts w:ascii="Times New Roman" w:hAnsi="Times New Roman" w:eastAsia="Times New Roman" w:cs="Times New Roman"/>
+      <w:rFonts w:ascii="Times New Roman" w:hAnsi="Times New Roman" w:cs="Times New Roman" w:eastAsia="Times New Roman"/>
       <w:color w:val="000000"/>
       <w:sz w:val="22"/>
     </w:rPr>
@@ -24639,7 +24477,7 @@
       <w:jc w:val="both"/>
     </w:pPr>
     <w:rPr>
-      <w:rFonts w:ascii="Times New Roman" w:hAnsi="Times New Roman" w:eastAsia="Times New Roman" w:cs="Times New Roman"/>
+      <w:rFonts w:ascii="Times New Roman" w:hAnsi="Times New Roman" w:cs="Times New Roman" w:eastAsia="Times New Roman"/>
       <w:color w:val="000000"/>
       <w:sz w:val="22"/>
     </w:rPr>
@@ -24654,7 +24492,7 @@
       <w:jc w:val="left"/>
     </w:pPr>
     <w:rPr>
-      <w:rFonts w:ascii="Times New Roman" w:hAnsi="Times New Roman" w:eastAsia="Times New Roman" w:cs="Times New Roman"/>
+      <w:rFonts w:ascii="Times New Roman" w:hAnsi="Times New Roman" w:cs="Times New Roman" w:eastAsia="Times New Roman"/>
       <w:color w:val="000000"/>
       <w:sz w:val="22"/>
     </w:rPr>
@@ -24672,7 +24510,7 @@
       <w:jc w:val="center"/>
     </w:pPr>
     <w:rPr>
-      <w:rFonts w:ascii="Times New Roman" w:hAnsi="Times New Roman" w:eastAsia="Times New Roman" w:cs="Times New Roman"/>
+      <w:rFonts w:ascii="Times New Roman" w:hAnsi="Times New Roman" w:cs="Times New Roman" w:eastAsia="Times New Roman"/>
       <w:b/>
       <w:bCs/>
       <w:i w:val="0"/>
@@ -24709,7 +24547,7 @@
       <w:jc w:val="center"/>
     </w:pPr>
     <w:rPr>
-      <w:rFonts w:ascii="Times New Roman" w:hAnsi="Times New Roman" w:eastAsia="Times New Roman" w:cs="Times New Roman"/>
+      <w:rFonts w:ascii="Times New Roman" w:hAnsi="Times New Roman" w:cs="Times New Roman" w:eastAsia="Times New Roman"/>
       <w:b w:val="0"/>
       <w:i w:val="0"/>
       <w:color w:val="000000"/>
@@ -24757,7 +24595,7 @@
       <w:jc w:val="both"/>
     </w:pPr>
     <w:rPr>
-      <w:rFonts w:ascii="Times New Roman" w:hAnsi="Times New Roman" w:eastAsia="Times New Roman" w:cs="Times New Roman"/>
+      <w:rFonts w:ascii="Times New Roman" w:hAnsi="Times New Roman" w:cs="Times New Roman" w:eastAsia="Times New Roman"/>
       <w:b w:val="0"/>
       <w:i w:val="0"/>
       <w:color w:val="000000"/>
@@ -25055,7 +24893,7 @@
       <w:jc w:val="left"/>
     </w:pPr>
     <w:rPr>
-      <w:rFonts w:ascii="Times New Roman" w:hAnsi="Times New Roman" w:eastAsia="Times New Roman" w:cs="Times New Roman"/>
+      <w:rFonts w:ascii="Times New Roman" w:hAnsi="Times New Roman" w:cs="Times New Roman" w:eastAsia="Times New Roman"/>
       <w:b w:val="0"/>
       <w:i w:val="0"/>
       <w:color w:val="000000"/>
@@ -25071,7 +24909,7 @@
       <w:jc w:val="both"/>
     </w:pPr>
     <w:rPr>
-      <w:rFonts w:ascii="Times New Roman" w:hAnsi="Times New Roman" w:eastAsia="Times New Roman" w:cs="Times New Roman"/>
+      <w:rFonts w:ascii="Times New Roman" w:hAnsi="Times New Roman" w:cs="Times New Roman" w:eastAsia="Times New Roman"/>
       <w:b w:val="0"/>
       <w:i w:val="0"/>
       <w:color w:val="000000"/>
@@ -25157,7 +24995,7 @@
       <w:jc w:val="center"/>
     </w:pPr>
     <w:rPr>
-      <w:rFonts w:ascii="Times New Roman" w:hAnsi="Times New Roman" w:eastAsia="Times New Roman" w:cs="Times New Roman"/>
+      <w:rFonts w:ascii="Times New Roman" w:hAnsi="Times New Roman" w:cs="Times New Roman" w:eastAsia="Times New Roman"/>
       <w:b w:val="0"/>
       <w:i/>
       <w:color w:val="000000"/>
@@ -25174,7 +25012,7 @@
       <w:jc w:val="left"/>
     </w:pPr>
     <w:rPr>
-      <w:rFonts w:ascii="Times New Roman" w:hAnsi="Times New Roman" w:eastAsia="Times New Roman" w:cs="Times New Roman"/>
+      <w:rFonts w:ascii="Times New Roman" w:hAnsi="Times New Roman" w:cs="Times New Roman" w:eastAsia="Times New Roman"/>
       <w:b w:val="0"/>
       <w:i w:val="0"/>
       <w:color w:val="000000"/>
@@ -25191,7 +25029,7 @@
       <w:jc w:val="left"/>
     </w:pPr>
     <w:rPr>
-      <w:rFonts w:ascii="Times New Roman" w:hAnsi="Times New Roman" w:eastAsia="Times New Roman" w:cs="Times New Roman"/>
+      <w:rFonts w:ascii="Times New Roman" w:hAnsi="Times New Roman" w:cs="Times New Roman" w:eastAsia="Times New Roman"/>
       <w:b w:val="0"/>
       <w:i w:val="0"/>
       <w:color w:val="000000"/>
@@ -25209,7 +25047,7 @@
       <w:jc w:val="left"/>
     </w:pPr>
     <w:rPr>
-      <w:rFonts w:ascii="Times New Roman" w:hAnsi="Times New Roman" w:eastAsia="Times New Roman" w:cs="Times New Roman"/>
+      <w:rFonts w:ascii="Times New Roman" w:hAnsi="Times New Roman" w:cs="Times New Roman" w:eastAsia="Times New Roman"/>
       <w:b/>
       <w:i w:val="0"/>
       <w:color w:val="000000"/>
@@ -25459,7 +25297,7 @@
       <w:jc w:val="left"/>
     </w:pPr>
     <w:rPr>
-      <w:rFonts w:ascii="Times New Roman" w:hAnsi="Times New Roman" w:eastAsia="Times New Roman" w:cs="Times New Roman"/>
+      <w:rFonts w:ascii="Times New Roman" w:hAnsi="Times New Roman" w:cs="Times New Roman" w:eastAsia="Times New Roman"/>
       <w:b w:val="0"/>
       <w:i w:val="0"/>
       <w:color w:val="000000"/>
@@ -25475,7 +25313,7 @@
       <w:jc w:val="both"/>
     </w:pPr>
     <w:rPr>
-      <w:rFonts w:ascii="Times New Roman" w:hAnsi="Times New Roman" w:eastAsia="Times New Roman" w:cs="Times New Roman"/>
+      <w:rFonts w:ascii="Times New Roman" w:hAnsi="Times New Roman" w:cs="Times New Roman" w:eastAsia="Times New Roman"/>
       <w:b w:val="0"/>
       <w:i w:val="0"/>
       <w:color w:val="000000"/>
@@ -25492,7 +25330,7 @@
       <w:jc w:val="left"/>
     </w:pPr>
     <w:rPr>
-      <w:rFonts w:ascii="Times New Roman" w:hAnsi="Times New Roman" w:eastAsia="Times New Roman" w:cs="Times New Roman"/>
+      <w:rFonts w:ascii="Times New Roman" w:hAnsi="Times New Roman" w:cs="Times New Roman" w:eastAsia="Times New Roman"/>
       <w:b/>
       <w:i w:val="0"/>
       <w:color w:val="000000"/>
@@ -25509,7 +25347,7 @@
       <w:jc w:val="left"/>
     </w:pPr>
     <w:rPr>
-      <w:rFonts w:ascii="Times New Roman" w:hAnsi="Times New Roman" w:eastAsia="Times New Roman" w:cs="Times New Roman"/>
+      <w:rFonts w:ascii="Times New Roman" w:hAnsi="Times New Roman" w:cs="Times New Roman" w:eastAsia="Times New Roman"/>
       <w:b/>
       <w:i w:val="0"/>
       <w:color w:val="000000"/>
@@ -25526,7 +25364,7 @@
       <w:jc w:val="left"/>
     </w:pPr>
     <w:rPr>
-      <w:rFonts w:ascii="Times New Roman" w:hAnsi="Times New Roman" w:eastAsia="Times New Roman" w:cs="Times New Roman"/>
+      <w:rFonts w:ascii="Times New Roman" w:hAnsi="Times New Roman" w:cs="Times New Roman" w:eastAsia="Times New Roman"/>
       <w:b w:val="0"/>
       <w:i/>
       <w:color w:val="000000"/>
@@ -25542,7 +25380,7 @@
       <w:jc w:val="both"/>
     </w:pPr>
     <w:rPr>
-      <w:rFonts w:ascii="Times New Roman" w:hAnsi="Times New Roman" w:eastAsia="Times New Roman" w:cs="Times New Roman"/>
+      <w:rFonts w:ascii="Times New Roman" w:hAnsi="Times New Roman" w:cs="Times New Roman" w:eastAsia="Times New Roman"/>
       <w:b w:val="0"/>
       <w:i w:val="0"/>
       <w:color w:val="000000"/>
@@ -25558,7 +25396,7 @@
       <w:jc w:val="left"/>
     </w:pPr>
     <w:rPr>
-      <w:rFonts w:ascii="Times New Roman" w:hAnsi="Times New Roman" w:eastAsia="Times New Roman" w:cs="Times New Roman"/>
+      <w:rFonts w:ascii="Times New Roman" w:hAnsi="Times New Roman" w:cs="Times New Roman" w:eastAsia="Times New Roman"/>
       <w:b w:val="0"/>
       <w:i w:val="0"/>
       <w:color w:val="000000"/>
@@ -25574,7 +25412,7 @@
       <w:jc w:val="both"/>
     </w:pPr>
     <w:rPr>
-      <w:rFonts w:ascii="Times New Roman" w:hAnsi="Times New Roman" w:eastAsia="Times New Roman" w:cs="Times New Roman"/>
+      <w:rFonts w:ascii="Times New Roman" w:hAnsi="Times New Roman" w:cs="Times New Roman" w:eastAsia="Times New Roman"/>
       <w:b w:val="0"/>
       <w:i w:val="0"/>
       <w:color w:val="000000"/>

</xml_diff>